<commit_message>
v0.11 Phase 2: move resolution as paired units
w:moveFrom/w:moveTo + range markers paired by w:name resolve as ONE unit
from either site. Accept: destination plain, source range removed (incl.
mark-stamped paragraph marks via the generalized mark machinery); reject
symmetric. Orphaned/duplicated/nameless/cross-story markup refuses by
name, batch-validated upfront. Multiround fixture rebuilt with Word's
block-level range-marker shape. Flagship invariants: accept_all(multiround)
== hand-computed accepted ground truth story-for-story; the gauntlet
resolves to zero markup in both directions.

Suites: paper 521, upstream pytest 1609, behave 650 — all green.

Co-Authored-By: Claude Fable 5 <noreply@anthropic.com>
</commit_message>
<xml_diff>
--- a/tests/paper/fixtures/generated/redline/multiround.docx
+++ b/tests/paper/fixtures/generated/redline/multiround.docx
@@ -24,39 +24,39 @@
         <w:t xml:space="preserve"> is made between the parties.</w:t>
       </w:r>
     </w:p>
+    <w:moveFromRangeStart w:id="103" w:author="Alice Editor" w:date="2026-06-01T09:30:00Z" w:name="mrMove1"/>
     <w:p>
       <w:pPr>
         <w:rPr>
           <w:moveFrom w:id="102" w:author="Alice Editor" w:date="2026-06-01T09:30:00Z"/>
         </w:rPr>
       </w:pPr>
-      <w:moveFromRangeStart w:id="103" w:author="Alice Editor" w:date="2026-06-01T09:30:00Z" w:name="mrMove1"/>
       <w:moveFrom w:id="104" w:author="Alice Editor" w:date="2026-06-01T09:30:00Z">
         <w:r>
           <w:t>The indemnity clause shall survive termination of this agreement.</w:t>
         </w:r>
       </w:moveFrom>
-      <w:moveFromRangeEnd w:id="103"/>
     </w:p>
+    <w:moveFromRangeEnd w:id="103"/>
     <w:p>
       <w:r>
         <w:t>Middle paragraph between the move sites.</w:t>
       </w:r>
     </w:p>
+    <w:moveToRangeStart w:id="106" w:author="Alice Editor" w:date="2026-06-01T09:30:00Z" w:name="mrMove1"/>
     <w:p>
       <w:pPr>
         <w:rPr>
           <w:moveTo w:id="105" w:author="Alice Editor" w:date="2026-06-01T09:30:00Z"/>
         </w:rPr>
       </w:pPr>
-      <w:moveToRangeStart w:id="106" w:author="Alice Editor" w:date="2026-06-01T09:30:00Z" w:name="mrMove1"/>
       <w:moveTo w:id="107" w:author="Alice Editor" w:date="2026-06-01T09:30:00Z">
         <w:r>
           <w:t>The indemnity clause shall survive termination of this agreement.</w:t>
         </w:r>
       </w:moveTo>
-      <w:moveToRangeEnd w:id="106"/>
     </w:p>
+    <w:moveToRangeEnd w:id="106"/>
     <w:p>
       <w:pPr>
         <w:jc w:val="center"/>

</xml_diff>